<commit_message>
Added Lab 9 doc, renamed photos used in Lab 7 and 9,added photos for lab 4 and 6, removed unused Lab 8 file, added Lab 7 and 9 tothe webiste and added photos to Lab 7 and 9's pages.
</commit_message>
<xml_diff>
--- a/Lab 5 evidence.docx
+++ b/Lab 5 evidence.docx
@@ -93,7 +93,7 @@
                     </pic:cNvPicPr>
                   </pic:nvPicPr>
                   <pic:blipFill>
-                    <a:blip r:embed="rId4">
+                    <a:blip r:embed="rId7">
                       <a:extLst>
                         <a:ext uri="{28A0092B-C50C-407E-A947-70E740481C1C}">
                           <a14:useLocalDpi xmlns:a14="http://schemas.microsoft.com/office/drawing/2010/main" val="0"/>
@@ -127,87 +127,77 @@
     </w:p>
     <w:p>
       <w:r>
-        <w:t xml:space="preserve">The first task of the lab required me to clone my repository on </w:t>
-      </w:r>
-      <w:proofErr w:type="spellStart"/>
-      <w:r>
-        <w:t>Github</w:t>
-      </w:r>
-      <w:proofErr w:type="spellEnd"/>
-      <w:r>
-        <w:t xml:space="preserve"> onto a virtual machine; to complete this task I had to log into the virtual machine download Git on the VM and then clone the contents into a repo.</w:t>
-      </w:r>
-    </w:p>
-    <w:p/>
-    <w:p>
-      <w:pPr>
-        <w:rPr>
-          <w:b/>
-          <w:bCs/>
-        </w:rPr>
-      </w:pPr>
-    </w:p>
-    <w:p>
-      <w:pPr>
-        <w:rPr>
-          <w:b/>
-          <w:bCs/>
-        </w:rPr>
-      </w:pPr>
-    </w:p>
-    <w:p>
-      <w:pPr>
-        <w:rPr>
-          <w:b/>
-          <w:bCs/>
-        </w:rPr>
-      </w:pPr>
-    </w:p>
-    <w:p>
-      <w:pPr>
-        <w:rPr>
-          <w:b/>
-          <w:bCs/>
-        </w:rPr>
-      </w:pPr>
-    </w:p>
-    <w:p>
-      <w:pPr>
-        <w:rPr>
-          <w:b/>
-          <w:bCs/>
-        </w:rPr>
-      </w:pPr>
-    </w:p>
-    <w:p>
-      <w:pPr>
-        <w:rPr>
-          <w:b/>
-          <w:bCs/>
-        </w:rPr>
-      </w:pPr>
-    </w:p>
-    <w:p>
-      <w:pPr>
-        <w:rPr>
-          <w:b/>
-          <w:bCs/>
-        </w:rPr>
-      </w:pPr>
-    </w:p>
-    <w:p>
-      <w:pPr>
-        <w:rPr>
-          <w:b/>
-          <w:bCs/>
-        </w:rPr>
-      </w:pPr>
-      <w:r>
-        <w:rPr>
-          <w:b/>
-          <w:bCs/>
-        </w:rPr>
-        <w:lastRenderedPageBreak/>
+        <w:t>The first task of the lab required me to clone my GitHub repository onto a virtual machine; to complete this task I had to log into the virtual machine, install Git on the virtual machine and then clone the repository contents onto the VM. The way that I cloned the contents of my repo was by using the developer command prompt on the VM; all I needed to do was initialise a repo on the VM and then clone the repo on GitHub into it using the link to the online repo to tell the VM what it is cloning from.</w:t>
+      </w:r>
+    </w:p>
+    <w:p>
+      <w:pPr>
+        <w:rPr>
+          <w:b/>
+          <w:bCs/>
+        </w:rPr>
+      </w:pPr>
+    </w:p>
+    <w:p>
+      <w:pPr>
+        <w:rPr>
+          <w:b/>
+          <w:bCs/>
+        </w:rPr>
+      </w:pPr>
+    </w:p>
+    <w:p>
+      <w:pPr>
+        <w:rPr>
+          <w:b/>
+          <w:bCs/>
+        </w:rPr>
+      </w:pPr>
+    </w:p>
+    <w:p>
+      <w:pPr>
+        <w:rPr>
+          <w:b/>
+          <w:bCs/>
+        </w:rPr>
+      </w:pPr>
+    </w:p>
+    <w:p>
+      <w:pPr>
+        <w:rPr>
+          <w:b/>
+          <w:bCs/>
+        </w:rPr>
+      </w:pPr>
+    </w:p>
+    <w:p>
+      <w:pPr>
+        <w:rPr>
+          <w:b/>
+          <w:bCs/>
+        </w:rPr>
+      </w:pPr>
+    </w:p>
+    <w:p>
+      <w:pPr>
+        <w:rPr>
+          <w:b/>
+          <w:bCs/>
+        </w:rPr>
+      </w:pPr>
+    </w:p>
+    <w:p>
+      <w:pPr>
+        <w:rPr>
+          <w:b/>
+          <w:bCs/>
+        </w:rPr>
+      </w:pPr>
+      <w:r>
+        <w:rPr>
+          <w:b/>
+          <w:bCs/>
+        </w:rPr>
         <w:t>Task 2:</w:t>
       </w:r>
     </w:p>
@@ -222,6 +212,7 @@
         <w:rPr>
           <w:b/>
           <w:bCs/>
+          <w:noProof/>
         </w:rPr>
         <w:drawing>
           <wp:inline distT="0" distB="0" distL="0" distR="0" wp14:anchorId="6625986E" wp14:editId="1BD2B0EA">
@@ -241,7 +232,7 @@
                     </pic:cNvPicPr>
                   </pic:nvPicPr>
                   <pic:blipFill>
-                    <a:blip r:embed="rId5" cstate="print">
+                    <a:blip r:embed="rId8" cstate="print">
                       <a:extLst>
                         <a:ext uri="{28A0092B-C50C-407E-A947-70E740481C1C}">
                           <a14:useLocalDpi xmlns:a14="http://schemas.microsoft.com/office/drawing/2010/main" val="0"/>
@@ -286,7 +277,27 @@
         <w:t xml:space="preserve"> folder in my virtual machine’s folder</w:t>
       </w:r>
       <w:r>
-        <w:t xml:space="preserve"> explorer and take the files for my website on the VM and paste them into the folder. After that I typed in a link that took me to my website being hosted from my VM.</w:t>
+        <w:t xml:space="preserve"> explorer and take the files for my website on the VM and paste them into the folder. </w:t>
+      </w:r>
+      <w:r>
+        <w:t xml:space="preserve">After moving the website files into the IIS </w:t>
+      </w:r>
+      <w:proofErr w:type="spellStart"/>
+      <w:r>
+        <w:t>wwwroot</w:t>
+      </w:r>
+      <w:proofErr w:type="spellEnd"/>
+      <w:r>
+        <w:t xml:space="preserve"> folder, I entered the VM’s IP address on </w:t>
+      </w:r>
+      <w:r>
+        <w:t>my machine</w:t>
+      </w:r>
+      <w:r>
+        <w:t xml:space="preserve"> which allowed me to access the website </w:t>
+      </w:r>
+      <w:r>
+        <w:t>on the virtual machine.</w:t>
       </w:r>
     </w:p>
     <w:p/>
@@ -297,6 +308,70 @@
           <w:bCs/>
         </w:rPr>
       </w:pPr>
+    </w:p>
+    <w:p>
+      <w:pPr>
+        <w:rPr>
+          <w:b/>
+          <w:bCs/>
+        </w:rPr>
+      </w:pPr>
+    </w:p>
+    <w:p>
+      <w:pPr>
+        <w:rPr>
+          <w:b/>
+          <w:bCs/>
+        </w:rPr>
+      </w:pPr>
+    </w:p>
+    <w:p>
+      <w:pPr>
+        <w:rPr>
+          <w:b/>
+          <w:bCs/>
+        </w:rPr>
+      </w:pPr>
+    </w:p>
+    <w:p>
+      <w:pPr>
+        <w:rPr>
+          <w:b/>
+          <w:bCs/>
+        </w:rPr>
+      </w:pPr>
+    </w:p>
+    <w:p>
+      <w:pPr>
+        <w:rPr>
+          <w:b/>
+          <w:bCs/>
+        </w:rPr>
+      </w:pPr>
+    </w:p>
+    <w:p>
+      <w:pPr>
+        <w:rPr>
+          <w:b/>
+          <w:bCs/>
+        </w:rPr>
+      </w:pPr>
+    </w:p>
+    <w:p>
+      <w:pPr>
+        <w:rPr>
+          <w:b/>
+          <w:bCs/>
+        </w:rPr>
+      </w:pPr>
+    </w:p>
+    <w:p>
+      <w:pPr>
+        <w:rPr>
+          <w:b/>
+          <w:bCs/>
+        </w:rPr>
+      </w:pPr>
       <w:r>
         <w:rPr>
           <w:b/>
@@ -316,6 +391,7 @@
         <w:rPr>
           <w:noProof/>
         </w:rPr>
+        <w:lastRenderedPageBreak/>
         <w:drawing>
           <wp:inline distT="0" distB="0" distL="0" distR="0" wp14:anchorId="00F41BB8" wp14:editId="5ED86EB1">
             <wp:extent cx="4940300" cy="2778304"/>
@@ -334,7 +410,7 @@
                     </pic:cNvPicPr>
                   </pic:nvPicPr>
                   <pic:blipFill>
-                    <a:blip r:embed="rId6" cstate="print">
+                    <a:blip r:embed="rId9" cstate="print">
                       <a:extLst>
                         <a:ext uri="{28A0092B-C50C-407E-A947-70E740481C1C}">
                           <a14:useLocalDpi xmlns:a14="http://schemas.microsoft.com/office/drawing/2010/main" val="0"/>
@@ -375,19 +451,76 @@
       </w:pPr>
     </w:p>
     <w:p>
-      <w:pPr>
-        <w:rPr>
-          <w:b/>
-          <w:bCs/>
-        </w:rPr>
-      </w:pPr>
-      <w:r>
-        <w:lastRenderedPageBreak/>
+      <w:r>
         <w:t xml:space="preserve">Finally, the final 2 tasks required me to create a new VM, put my repos contents on the new VM and host my website on the second VM as well as on the first VM which involved repeating the same steps from task 1 and 2. Once </w:t>
       </w:r>
       <w:r>
-        <w:t>I hosted the website on the second virtual machine I had to show that I had made a change to the website on my second VM. To do this I had to install VS code on the second VM, paste the code for my website in to and make some changes to the website. Once I changed the background colour of my website on the second VM, I saved the changes, hosted the website of the second VM and then took this screenshot to show both VMs hosting each website.</w:t>
-      </w:r>
+        <w:t>I hosted the website on the second virtual machine I had to show that I had made a change to the website on my second VM. To do this I had to install VS code on the second VM, paste the code for my website into</w:t>
+      </w:r>
+      <w:r>
+        <w:t xml:space="preserve"> VS code</w:t>
+      </w:r>
+      <w:r>
+        <w:t xml:space="preserve"> and make some changes to the website. Once I changed the background colour of my website on the second VM, I saved the changes, hosted the website </w:t>
+      </w:r>
+      <w:r>
+        <w:t>from</w:t>
+      </w:r>
+      <w:r>
+        <w:t xml:space="preserve"> the second VM and then took this screenshot to show both VMs hosting each website.</w:t>
+      </w:r>
+      <w:r>
+        <w:t xml:space="preserve"> By showing tha</w:t>
+      </w:r>
+      <w:r>
+        <w:t xml:space="preserve">t each VM had a different website running on them, it shows </w:t>
+      </w:r>
+      <w:r>
+        <w:t xml:space="preserve">that each </w:t>
+      </w:r>
+      <w:r>
+        <w:t xml:space="preserve">VM </w:t>
+      </w:r>
+      <w:r>
+        <w:t>could host</w:t>
+      </w:r>
+      <w:r>
+        <w:t xml:space="preserve"> a website independently from one another</w:t>
+      </w:r>
+      <w:r>
+        <w:t>.</w:t>
+      </w:r>
+    </w:p>
+    <w:p/>
+    <w:p>
+      <w:pPr>
+        <w:rPr>
+          <w:b/>
+          <w:bCs/>
+        </w:rPr>
+      </w:pPr>
+      <w:r>
+        <w:rPr>
+          <w:b/>
+          <w:bCs/>
+        </w:rPr>
+        <w:t>Reflection:</w:t>
+      </w:r>
+    </w:p>
+    <w:p>
+      <w:pPr>
+        <w:rPr>
+          <w:b/>
+          <w:bCs/>
+        </w:rPr>
+      </w:pPr>
+    </w:p>
+    <w:p>
+      <w:r>
+        <w:t>The content for Lab 5 started to teach me how to use virtual machines which is an essential skill in software development as it will allow me to produce and test any software that I produce without affecting the local machine creating a safety net for any local machines that I use. I learnt how to log into multiple VMs, how to use GitHub and the developer command prompt to grant access to my files on the virtual machine and how to install software onto virtual machines so that I could make changes to my website on each virtual machine.</w:t>
+      </w:r>
+    </w:p>
+    <w:p>
       <w:r>
         <w:rPr>
           <w:b/>
@@ -1017,6 +1150,7 @@
   <w:style w:type="character" w:default="1" w:styleId="DefaultParagraphFont">
     <w:name w:val="Default Paragraph Font"/>
     <w:uiPriority w:val="1"/>
+    <w:semiHidden/>
     <w:unhideWhenUsed/>
   </w:style>
   <w:style w:type="table" w:default="1" w:styleId="TableNormal">
@@ -1646,4 +1780,230 @@
     </a:ext>
   </a:extLst>
 </a:theme>
+</file>
+
+<file path=customXml/item1.xml><?xml version="1.0" encoding="utf-8"?>
+<?mso-contentType ?>
+<FormTemplates xmlns="http://schemas.microsoft.com/sharepoint/v3/contenttype/forms">
+  <Display>DocumentLibraryForm</Display>
+  <Edit>DocumentLibraryForm</Edit>
+  <New>DocumentLibraryForm</New>
+</FormTemplates>
+</file>
+
+<file path=customXml/item2.xml><?xml version="1.0" encoding="utf-8"?>
+<ct:contentTypeSchema xmlns:ct="http://schemas.microsoft.com/office/2006/metadata/contentType" xmlns:ma="http://schemas.microsoft.com/office/2006/metadata/properties/metaAttributes" ct:_="" ma:_="" ma:contentTypeName="Document" ma:contentTypeID="0x010100148E24640125A845A83BA34495661BD8" ma:contentTypeVersion="8" ma:contentTypeDescription="Create a new document." ma:contentTypeScope="" ma:versionID="001eb1e927652a38e27a059a67fe10cf">
+  <xsd:schema xmlns:xsd="http://www.w3.org/2001/XMLSchema" xmlns:xs="http://www.w3.org/2001/XMLSchema" xmlns:p="http://schemas.microsoft.com/office/2006/metadata/properties" xmlns:ns3="6fcbddfa-399d-4474-aea8-037e0c43d770" targetNamespace="http://schemas.microsoft.com/office/2006/metadata/properties" ma:root="true" ma:fieldsID="c6e68dbe1986afe4aa9fa28514a9b372" ns3:_="">
+    <xsd:import namespace="6fcbddfa-399d-4474-aea8-037e0c43d770"/>
+    <xsd:element name="properties">
+      <xsd:complexType>
+        <xsd:sequence>
+          <xsd:element name="documentManagement">
+            <xsd:complexType>
+              <xsd:all>
+                <xsd:element ref="ns3:MediaServiceDateTaken" minOccurs="0"/>
+                <xsd:element ref="ns3:MediaServiceMetadata" minOccurs="0"/>
+                <xsd:element ref="ns3:MediaServiceFastMetadata" minOccurs="0"/>
+                <xsd:element ref="ns3:MediaServiceSearchProperties" minOccurs="0"/>
+                <xsd:element ref="ns3:MediaServiceSystemTags" minOccurs="0"/>
+                <xsd:element ref="ns3:MediaServiceOCR" minOccurs="0"/>
+                <xsd:element ref="ns3:MediaServiceGenerationTime" minOccurs="0"/>
+                <xsd:element ref="ns3:MediaServiceEventHashCode" minOccurs="0"/>
+              </xsd:all>
+            </xsd:complexType>
+          </xsd:element>
+        </xsd:sequence>
+      </xsd:complexType>
+    </xsd:element>
+  </xsd:schema>
+  <xsd:schema xmlns:xsd="http://www.w3.org/2001/XMLSchema" xmlns:xs="http://www.w3.org/2001/XMLSchema" xmlns:dms="http://schemas.microsoft.com/office/2006/documentManagement/types" xmlns:pc="http://schemas.microsoft.com/office/infopath/2007/PartnerControls" targetNamespace="6fcbddfa-399d-4474-aea8-037e0c43d770" elementFormDefault="qualified">
+    <xsd:import namespace="http://schemas.microsoft.com/office/2006/documentManagement/types"/>
+    <xsd:import namespace="http://schemas.microsoft.com/office/infopath/2007/PartnerControls"/>
+    <xsd:element name="MediaServiceDateTaken" ma:index="8" nillable="true" ma:displayName="MediaServiceDateTaken" ma:hidden="true" ma:indexed="true" ma:internalName="MediaServiceDateTaken" ma:readOnly="true">
+      <xsd:simpleType>
+        <xsd:restriction base="dms:Text"/>
+      </xsd:simpleType>
+    </xsd:element>
+    <xsd:element name="MediaServiceMetadata" ma:index="9" nillable="true" ma:displayName="MediaServiceMetadata" ma:hidden="true" ma:internalName="MediaServiceMetadata" ma:readOnly="true">
+      <xsd:simpleType>
+        <xsd:restriction base="dms:Note"/>
+      </xsd:simpleType>
+    </xsd:element>
+    <xsd:element name="MediaServiceFastMetadata" ma:index="10" nillable="true" ma:displayName="MediaServiceFastMetadata" ma:hidden="true" ma:internalName="MediaServiceFastMetadata" ma:readOnly="true">
+      <xsd:simpleType>
+        <xsd:restriction base="dms:Note"/>
+      </xsd:simpleType>
+    </xsd:element>
+    <xsd:element name="MediaServiceSearchProperties" ma:index="11" nillable="true" ma:displayName="MediaServiceSearchProperties" ma:hidden="true" ma:internalName="MediaServiceSearchProperties" ma:readOnly="true">
+      <xsd:simpleType>
+        <xsd:restriction base="dms:Note"/>
+      </xsd:simpleType>
+    </xsd:element>
+    <xsd:element name="MediaServiceSystemTags" ma:index="12" nillable="true" ma:displayName="MediaServiceSystemTags" ma:hidden="true" ma:internalName="MediaServiceSystemTags" ma:readOnly="true">
+      <xsd:simpleType>
+        <xsd:restriction base="dms:Note"/>
+      </xsd:simpleType>
+    </xsd:element>
+    <xsd:element name="MediaServiceOCR" ma:index="13" nillable="true" ma:displayName="Extracted Text" ma:internalName="MediaServiceOCR" ma:readOnly="true">
+      <xsd:simpleType>
+        <xsd:restriction base="dms:Note">
+          <xsd:maxLength value="255"/>
+        </xsd:restriction>
+      </xsd:simpleType>
+    </xsd:element>
+    <xsd:element name="MediaServiceGenerationTime" ma:index="14" nillable="true" ma:displayName="MediaServiceGenerationTime" ma:hidden="true" ma:internalName="MediaServiceGenerationTime" ma:readOnly="true">
+      <xsd:simpleType>
+        <xsd:restriction base="dms:Text"/>
+      </xsd:simpleType>
+    </xsd:element>
+    <xsd:element name="MediaServiceEventHashCode" ma:index="15" nillable="true" ma:displayName="MediaServiceEventHashCode" ma:hidden="true" ma:internalName="MediaServiceEventHashCode" ma:readOnly="true">
+      <xsd:simpleType>
+        <xsd:restriction base="dms:Text"/>
+      </xsd:simpleType>
+    </xsd:element>
+  </xsd:schema>
+  <xsd:schema xmlns="http://schemas.openxmlformats.org/package/2006/metadata/core-properties" xmlns:xsd="http://www.w3.org/2001/XMLSchema" xmlns:xsi="http://www.w3.org/2001/XMLSchema-instance" xmlns:dc="http://purl.org/dc/elements/1.1/" xmlns:dcterms="http://purl.org/dc/terms/" xmlns:odoc="http://schemas.microsoft.com/internal/obd" targetNamespace="http://schemas.openxmlformats.org/package/2006/metadata/core-properties" elementFormDefault="qualified" attributeFormDefault="unqualified" blockDefault="#all">
+    <xsd:import namespace="http://purl.org/dc/elements/1.1/" schemaLocation="http://dublincore.org/schemas/xmls/qdc/2003/04/02/dc.xsd"/>
+    <xsd:import namespace="http://purl.org/dc/terms/" schemaLocation="http://dublincore.org/schemas/xmls/qdc/2003/04/02/dcterms.xsd"/>
+    <xsd:element name="coreProperties" type="CT_coreProperties"/>
+    <xsd:complexType name="CT_coreProperties">
+      <xsd:all>
+        <xsd:element ref="dc:creator" minOccurs="0" maxOccurs="1"/>
+        <xsd:element ref="dcterms:created" minOccurs="0" maxOccurs="1"/>
+        <xsd:element ref="dc:identifier" minOccurs="0" maxOccurs="1"/>
+        <xsd:element name="contentType" minOccurs="0" maxOccurs="1" type="xsd:string" ma:index="0" ma:displayName="Content Type"/>
+        <xsd:element ref="dc:title" minOccurs="0" maxOccurs="1" ma:index="4" ma:displayName="Title"/>
+        <xsd:element ref="dc:subject" minOccurs="0" maxOccurs="1"/>
+        <xsd:element ref="dc:description" minOccurs="0" maxOccurs="1"/>
+        <xsd:element name="keywords" minOccurs="0" maxOccurs="1" type="xsd:string"/>
+        <xsd:element ref="dc:language" minOccurs="0" maxOccurs="1"/>
+        <xsd:element name="category" minOccurs="0" maxOccurs="1" type="xsd:string"/>
+        <xsd:element name="version" minOccurs="0" maxOccurs="1" type="xsd:string"/>
+        <xsd:element name="revision" minOccurs="0" maxOccurs="1" type="xsd:string">
+          <xsd:annotation>
+            <xsd:documentation>
+                        This value indicates the number of saves or revisions. The application is responsible for updating this value after each revision.
+                    </xsd:documentation>
+          </xsd:annotation>
+        </xsd:element>
+        <xsd:element name="lastModifiedBy" minOccurs="0" maxOccurs="1" type="xsd:string"/>
+        <xsd:element ref="dcterms:modified" minOccurs="0" maxOccurs="1"/>
+        <xsd:element name="contentStatus" minOccurs="0" maxOccurs="1" type="xsd:string"/>
+      </xsd:all>
+    </xsd:complexType>
+  </xsd:schema>
+  <xs:schema xmlns:pc="http://schemas.microsoft.com/office/infopath/2007/PartnerControls" xmlns:xs="http://www.w3.org/2001/XMLSchema" targetNamespace="http://schemas.microsoft.com/office/infopath/2007/PartnerControls" elementFormDefault="qualified" attributeFormDefault="unqualified">
+    <xs:element name="Person">
+      <xs:complexType>
+        <xs:sequence>
+          <xs:element ref="pc:DisplayName" minOccurs="0"/>
+          <xs:element ref="pc:AccountId" minOccurs="0"/>
+          <xs:element ref="pc:AccountType" minOccurs="0"/>
+        </xs:sequence>
+      </xs:complexType>
+    </xs:element>
+    <xs:element name="DisplayName" type="xs:string"/>
+    <xs:element name="AccountId" type="xs:string"/>
+    <xs:element name="AccountType" type="xs:string"/>
+    <xs:element name="BDCAssociatedEntity">
+      <xs:complexType>
+        <xs:sequence>
+          <xs:element ref="pc:BDCEntity" minOccurs="0" maxOccurs="unbounded"/>
+        </xs:sequence>
+        <xs:attribute ref="pc:EntityNamespace"/>
+        <xs:attribute ref="pc:EntityName"/>
+        <xs:attribute ref="pc:SystemInstanceName"/>
+        <xs:attribute ref="pc:AssociationName"/>
+      </xs:complexType>
+    </xs:element>
+    <xs:attribute name="EntityNamespace" type="xs:string"/>
+    <xs:attribute name="EntityName" type="xs:string"/>
+    <xs:attribute name="SystemInstanceName" type="xs:string"/>
+    <xs:attribute name="AssociationName" type="xs:string"/>
+    <xs:element name="BDCEntity">
+      <xs:complexType>
+        <xs:sequence>
+          <xs:element ref="pc:EntityDisplayName" minOccurs="0"/>
+          <xs:element ref="pc:EntityInstanceReference" minOccurs="0"/>
+          <xs:element ref="pc:EntityId1" minOccurs="0"/>
+          <xs:element ref="pc:EntityId2" minOccurs="0"/>
+          <xs:element ref="pc:EntityId3" minOccurs="0"/>
+          <xs:element ref="pc:EntityId4" minOccurs="0"/>
+          <xs:element ref="pc:EntityId5" minOccurs="0"/>
+        </xs:sequence>
+      </xs:complexType>
+    </xs:element>
+    <xs:element name="EntityDisplayName" type="xs:string"/>
+    <xs:element name="EntityInstanceReference" type="xs:string"/>
+    <xs:element name="EntityId1" type="xs:string"/>
+    <xs:element name="EntityId2" type="xs:string"/>
+    <xs:element name="EntityId3" type="xs:string"/>
+    <xs:element name="EntityId4" type="xs:string"/>
+    <xs:element name="EntityId5" type="xs:string"/>
+    <xs:element name="Terms">
+      <xs:complexType>
+        <xs:sequence>
+          <xs:element ref="pc:TermInfo" minOccurs="0" maxOccurs="unbounded"/>
+        </xs:sequence>
+      </xs:complexType>
+    </xs:element>
+    <xs:element name="TermInfo">
+      <xs:complexType>
+        <xs:sequence>
+          <xs:element ref="pc:TermName" minOccurs="0"/>
+          <xs:element ref="pc:TermId" minOccurs="0"/>
+        </xs:sequence>
+      </xs:complexType>
+    </xs:element>
+    <xs:element name="TermName" type="xs:string"/>
+    <xs:element name="TermId" type="xs:string"/>
+  </xs:schema>
+</ct:contentTypeSchema>
+</file>
+
+<file path=customXml/item3.xml><?xml version="1.0" encoding="utf-8"?>
+<p:properties xmlns:p="http://schemas.microsoft.com/office/2006/metadata/properties" xmlns:xsi="http://www.w3.org/2001/XMLSchema-instance" xmlns:pc="http://schemas.microsoft.com/office/infopath/2007/PartnerControls">
+  <documentManagement/>
+</p:properties>
+</file>
+
+<file path=customXml/itemProps1.xml><?xml version="1.0" encoding="utf-8"?>
+<ds:datastoreItem xmlns:ds="http://schemas.openxmlformats.org/officeDocument/2006/customXml" ds:itemID="{A85087F8-FCDA-4E02-8A45-5C9D10FF9711}">
+  <ds:schemaRefs>
+    <ds:schemaRef ds:uri="http://schemas.microsoft.com/sharepoint/v3/contenttype/forms"/>
+  </ds:schemaRefs>
+</ds:datastoreItem>
+</file>
+
+<file path=customXml/itemProps2.xml><?xml version="1.0" encoding="utf-8"?>
+<ds:datastoreItem xmlns:ds="http://schemas.openxmlformats.org/officeDocument/2006/customXml" ds:itemID="{868F48D1-07AF-409D-AD78-BEA1C7B08E24}">
+  <ds:schemaRefs>
+    <ds:schemaRef ds:uri="http://schemas.microsoft.com/office/2006/metadata/contentType"/>
+    <ds:schemaRef ds:uri="http://schemas.microsoft.com/office/2006/metadata/properties/metaAttributes"/>
+    <ds:schemaRef ds:uri="http://www.w3.org/2001/XMLSchema"/>
+    <ds:schemaRef ds:uri="http://schemas.microsoft.com/office/2006/metadata/properties"/>
+    <ds:schemaRef ds:uri="6fcbddfa-399d-4474-aea8-037e0c43d770"/>
+    <ds:schemaRef ds:uri="http://schemas.microsoft.com/office/2006/documentManagement/types"/>
+    <ds:schemaRef ds:uri="http://schemas.microsoft.com/office/infopath/2007/PartnerControls"/>
+    <ds:schemaRef ds:uri="http://schemas.openxmlformats.org/package/2006/metadata/core-properties"/>
+    <ds:schemaRef ds:uri="http://purl.org/dc/elements/1.1/"/>
+    <ds:schemaRef ds:uri="http://purl.org/dc/terms/"/>
+    <ds:schemaRef ds:uri="http://schemas.microsoft.com/internal/obd"/>
+  </ds:schemaRefs>
+</ds:datastoreItem>
+</file>
+
+<file path=customXml/itemProps3.xml><?xml version="1.0" encoding="utf-8"?>
+<ds:datastoreItem xmlns:ds="http://schemas.openxmlformats.org/officeDocument/2006/customXml" ds:itemID="{D40D8C58-DBB9-4528-A841-5204CF2FA5E8}">
+  <ds:schemaRefs>
+    <ds:schemaRef ds:uri="http://schemas.microsoft.com/office/2006/metadata/properties"/>
+    <ds:schemaRef ds:uri="http://schemas.microsoft.com/office/infopath/2007/PartnerControls"/>
+  </ds:schemaRefs>
+</ds:datastoreItem>
+</file>
+
+<file path=docMetadata/LabelInfo.xml><?xml version="1.0" encoding="utf-8"?>
+<clbl:labelList xmlns:clbl="http://schemas.microsoft.com/office/2020/mipLabelMetadata">
+  <clbl:label id="{490a8197-7b83-4f10-89b9-83189be3835e}" enabled="0" method="" siteId="{490a8197-7b83-4f10-89b9-83189be3835e}" removed="1"/>
+</clbl:labelList>
 </file>
</xml_diff>